<commit_message>
Programming Exercise 3 finished
</commit_message>
<xml_diff>
--- a/Programming_exercise_3/MariaGalante_ProgrammingExercise_3.docx
+++ b/Programming_exercise_3/MariaGalante_ProgrammingExercise_3.docx
@@ -2,7 +2,6 @@
 <file path=word/document.xml><?xml version="1.0" encoding="utf-8"?>
 <w:document xmlns:wpc="http://schemas.microsoft.com/office/word/2010/wordprocessingCanvas" xmlns:cx="http://schemas.microsoft.com/office/drawing/2014/chartex" xmlns:cx1="http://schemas.microsoft.com/office/drawing/2015/9/8/chartex" xmlns:cx2="http://schemas.microsoft.com/office/drawing/2015/10/21/chartex" xmlns:cx3="http://schemas.microsoft.com/office/drawing/2016/5/9/chartex" xmlns:cx4="http://schemas.microsoft.com/office/drawing/2016/5/10/chartex" xmlns:cx5="http://schemas.microsoft.com/office/drawing/2016/5/11/chartex" xmlns:cx6="http://schemas.microsoft.com/office/drawing/2016/5/12/chartex" xmlns:cx7="http://schemas.microsoft.com/office/drawing/2016/5/13/chartex" xmlns:cx8="http://schemas.microsoft.com/office/drawing/2016/5/14/chartex" xmlns:mc="http://schemas.openxmlformats.org/markup-compatibility/2006" xmlns:aink="http://schemas.microsoft.com/office/drawing/2016/ink" xmlns:am3d="http://schemas.microsoft.com/office/drawing/2017/model3d" xmlns:o="urn:schemas-microsoft-com:office:office" xmlns:oel="http://schemas.microsoft.com/office/2019/extlst" xmlns:r="http://schemas.openxmlformats.org/officeDocument/2006/relationships" xmlns:m="http://schemas.openxmlformats.org/officeDocument/2006/math" xmlns:v="urn:schemas-microsoft-com:vml" xmlns:wp14="http://schemas.microsoft.com/office/word/2010/wordprocessingDrawing" xmlns:wp="http://schemas.openxmlformats.org/drawingml/2006/wordprocessingDrawing" xmlns:w10="urn:schemas-microsoft-com:office:word" xmlns:w="http://schemas.openxmlformats.org/wordprocessingml/2006/main" xmlns:w14="http://schemas.microsoft.com/office/word/2010/wordml" xmlns:w15="http://schemas.microsoft.com/office/word/2012/wordml" xmlns:w16cex="http://schemas.microsoft.com/office/word/2018/wordml/cex" xmlns:w16cid="http://schemas.microsoft.com/office/word/2016/wordml/cid" xmlns:w16="http://schemas.microsoft.com/office/word/2018/wordml" xmlns:w16du="http://schemas.microsoft.com/office/word/2023/wordml/word16du" xmlns:w16sdtdh="http://schemas.microsoft.com/office/word/2020/wordml/sdtdatahash" xmlns:w16sdtfl="http://schemas.microsoft.com/office/word/2024/wordml/sdtformatlock" xmlns:w16se="http://schemas.microsoft.com/office/word/2015/wordml/symex" xmlns:wpg="http://schemas.microsoft.com/office/word/2010/wordprocessingGroup" xmlns:wpi="http://schemas.microsoft.com/office/word/2010/wordprocessingInk" xmlns:wne="http://schemas.microsoft.com/office/word/2006/wordml" xmlns:wps="http://schemas.microsoft.com/office/word/2010/wordprocessingShape" mc:Ignorable="w14 w15 w16se w16cid w16 w16cex w16sdtdh w16sdtfl w16du wp14">
   <w:body>
-    <w:p/>
     <w:p>
       <w:pPr>
         <w:rPr>
@@ -19,27 +18,10 @@
           <w:sz w:val="24"/>
           <w:szCs w:val="24"/>
         </w:rPr>
-        <w:t># Technical Design Document: MariaGalante_ProgrammingExercise_</w:t>
-      </w:r>
-      <w:r>
-        <w:rPr>
-          <w:b/>
-          <w:bCs/>
-          <w:sz w:val="24"/>
-          <w:szCs w:val="24"/>
-        </w:rPr>
-        <w:t>3</w:t>
-      </w:r>
-      <w:r>
-        <w:rPr>
-          <w:b/>
-          <w:bCs/>
-          <w:sz w:val="24"/>
-          <w:szCs w:val="24"/>
-        </w:rPr>
-        <w:br/>
+        <w:t># Technical Design Document: MariaGalante_ProgrammingExercise_3</w:t>
       </w:r>
     </w:p>
+    <w:p/>
     <w:p>
       <w:r>
         <w:t># Name: Maria Galante</w:t>
@@ -52,45 +34,55 @@
     </w:p>
     <w:p>
       <w:r>
-        <w:rPr>
-          <w:b/>
-          <w:bCs/>
-        </w:rPr>
-        <w:t xml:space="preserve"># Program Description: </w:t>
+        <w:t xml:space="preserve"># Program Description: This program asks the user to enter a list of their monthly expenses. For each expense, the user enters the type of expense and the amount. After all expenses are entered, the program uses the </w:t>
       </w:r>
+      <w:proofErr w:type="gramStart"/>
       <w:r>
-        <w:t>This program asks the user to enter a list of their monthly expenses. For each expense, the user enters the type and the amount. After all expenses are entered, the program uses the reduce() method to calculate the total expenses and determine the highest and lowest expenses. The program then displays the total expense along with clearly labeled highest and lowest expenses.</w:t>
+        <w:t>reduce(</w:t>
+      </w:r>
+      <w:proofErr w:type="gramEnd"/>
+      <w:r>
+        <w:t>) method to calculate the total expenses and determine the highest and lowest expenses. The program then displays the total expense along with clearly labeled highest and lowest expenses.</w:t>
       </w:r>
     </w:p>
+    <w:p/>
     <w:p>
-      <w:r>
-        <w:br/>
-      </w:r>
       <w:r>
         <w:rPr>
           <w:b/>
           <w:bCs/>
+          <w:sz w:val="24"/>
+          <w:szCs w:val="24"/>
         </w:rPr>
         <w:t>## Function:</w:t>
       </w:r>
       <w:r>
-        <w:t xml:space="preserve"> get_expenses</w:t>
+        <w:rPr>
+          <w:sz w:val="24"/>
+          <w:szCs w:val="24"/>
+        </w:rPr>
+        <w:t xml:space="preserve"> </w:t>
       </w:r>
+      <w:proofErr w:type="spellStart"/>
       <w:r>
-        <w:br/>
+        <w:t>get_expenses</w:t>
+      </w:r>
+      <w:proofErr w:type="spellEnd"/>
+    </w:p>
+    <w:p>
+      <w:r>
+        <w:t>This function asks the user for expense types and amounts and stores them in a list.</w:t>
       </w:r>
     </w:p>
     <w:p>
       <w:r>
         <w:t>Parameters:</w:t>
       </w:r>
-    </w:p>
-    <w:p>
+      <w:r>
+        <w:t xml:space="preserve"> </w:t>
+      </w:r>
       <w:r>
         <w:t>None</w:t>
-      </w:r>
-      <w:r>
-        <w:br/>
       </w:r>
     </w:p>
     <w:p>
@@ -102,22 +94,38 @@
       <w:r>
         <w:t>expenses (list): Stores expense tuples.</w:t>
       </w:r>
+    </w:p>
+    <w:p>
+      <w:proofErr w:type="spellStart"/>
       <w:r>
-        <w:br/>
-        <w:t>expense_type (str): Name of the expense.</w:t>
+        <w:t>expense_type</w:t>
       </w:r>
+      <w:proofErr w:type="spellEnd"/>
       <w:r>
-        <w:br/>
+        <w:t xml:space="preserve"> (str): Name of the expense.</w:t>
+      </w:r>
+    </w:p>
+    <w:p>
+      <w:r>
         <w:t>amount (float): Cost of the expense.</w:t>
       </w:r>
+    </w:p>
+    <w:p>
       <w:r>
-        <w:br/>
         <w:t>more (str): Controls loop continuation.</w:t>
       </w:r>
+    </w:p>
+    <w:p>
+      <w:proofErr w:type="spellStart"/>
       <w:r>
-        <w:br/>
+        <w:t>amount_raw</w:t>
+      </w:r>
+      <w:proofErr w:type="spellEnd"/>
+      <w:r>
+        <w:t xml:space="preserve"> (str): Raw amount input before converting to float.</w:t>
       </w:r>
     </w:p>
+    <w:p/>
     <w:p>
       <w:r>
         <w:t>Logic:</w:t>
@@ -127,34 +135,44 @@
       <w:r>
         <w:t>1. Create an empty list.</w:t>
       </w:r>
+    </w:p>
+    <w:p>
       <w:r>
-        <w:br/>
         <w:t>2. Prompt user for expense type.</w:t>
       </w:r>
+    </w:p>
+    <w:p>
       <w:r>
-        <w:br/>
         <w:t>3. Prompt user for expense amount.</w:t>
       </w:r>
+    </w:p>
+    <w:p>
       <w:r>
-        <w:br/>
-        <w:t>4. Store values in a tuple.</w:t>
-      </w:r>
-      <w:r>
-        <w:br/>
-        <w:t>5. Ask if user wants to continue.</w:t>
-      </w:r>
-      <w:r>
-        <w:br/>
-        <w:t>6. Repeat until user stops.</w:t>
-      </w:r>
-      <w:r>
-        <w:br/>
-        <w:t>7. Return the list of expenses.</w:t>
-      </w:r>
-      <w:r>
-        <w:br/>
+        <w:t>4. Validate amount is a number and non-negative.</w:t>
       </w:r>
     </w:p>
+    <w:p>
+      <w:r>
+        <w:t>5. Store values in a tuple.</w:t>
+      </w:r>
+    </w:p>
+    <w:p>
+      <w:r>
+        <w:t>6. Ask if user wants to continue.</w:t>
+      </w:r>
+    </w:p>
+    <w:p>
+      <w:r>
+        <w:t>7. Repeat until user stops.</w:t>
+      </w:r>
+    </w:p>
+    <w:p>
+      <w:r>
+        <w:lastRenderedPageBreak/>
+        <w:t>8. Return the list of expenses.</w:t>
+      </w:r>
+    </w:p>
+    <w:p/>
     <w:p>
       <w:r>
         <w:t>Return:</w:t>
@@ -165,11 +183,9 @@
         <w:t>List of expense tuples.</w:t>
       </w:r>
     </w:p>
+    <w:p/>
+    <w:p/>
     <w:p>
-      <w:r>
-        <w:lastRenderedPageBreak/>
-        <w:br/>
-      </w:r>
       <w:r>
         <w:rPr>
           <w:b/>
@@ -180,23 +196,40 @@
         <w:t>## Function:</w:t>
       </w:r>
       <w:r>
-        <w:t xml:space="preserve"> calculate_total</w:t>
+        <w:rPr>
+          <w:sz w:val="24"/>
+          <w:szCs w:val="24"/>
+        </w:rPr>
+        <w:t xml:space="preserve"> </w:t>
       </w:r>
+      <w:proofErr w:type="spellStart"/>
       <w:r>
-        <w:br/>
+        <w:t>calculate_total</w:t>
+      </w:r>
+      <w:proofErr w:type="spellEnd"/>
+    </w:p>
+    <w:p>
+      <w:r>
+        <w:t xml:space="preserve">This function uses </w:t>
+      </w:r>
+      <w:proofErr w:type="gramStart"/>
+      <w:r>
+        <w:t>reduce(</w:t>
+      </w:r>
+      <w:proofErr w:type="gramEnd"/>
+      <w:r>
+        <w:t>) to add all expense amounts together.</w:t>
       </w:r>
     </w:p>
     <w:p>
       <w:r>
         <w:t>Parameters:</w:t>
       </w:r>
-    </w:p>
-    <w:p>
+      <w:r>
+        <w:t xml:space="preserve"> </w:t>
+      </w:r>
       <w:r>
         <w:t>expenses (list): List of expense tuples.</w:t>
-      </w:r>
-      <w:r>
-        <w:br/>
       </w:r>
     </w:p>
     <w:p>
@@ -208,10 +241,8 @@
       <w:r>
         <w:t>total (float): Stores total expense amount.</w:t>
       </w:r>
-      <w:r>
-        <w:br/>
-      </w:r>
     </w:p>
+    <w:p/>
     <w:p>
       <w:r>
         <w:t>Logic:</w:t>
@@ -219,20 +250,44 @@
     </w:p>
     <w:p>
       <w:r>
-        <w:t>1. Use reduce() to add all expense amounts.</w:t>
+        <w:t xml:space="preserve">1. Use </w:t>
       </w:r>
+      <w:proofErr w:type="gramStart"/>
       <w:r>
-        <w:br/>
-        <w:t>2. Store result in total.</w:t>
+        <w:t>reduce(</w:t>
       </w:r>
+      <w:proofErr w:type="gramEnd"/>
       <w:r>
-        <w:br/>
+        <w:t xml:space="preserve">) to sum all </w:t>
+      </w:r>
+      <w:proofErr w:type="gramStart"/>
+      <w:r>
+        <w:t>expense amounts</w:t>
+      </w:r>
+      <w:proofErr w:type="gramEnd"/>
+      <w:r>
+        <w:t>.</w:t>
+      </w:r>
+    </w:p>
+    <w:p>
+      <w:r>
+        <w:t xml:space="preserve">2. Store </w:t>
+      </w:r>
+      <w:proofErr w:type="gramStart"/>
+      <w:r>
+        <w:t>result</w:t>
+      </w:r>
+      <w:proofErr w:type="gramEnd"/>
+      <w:r>
+        <w:t xml:space="preserve"> in total.</w:t>
+      </w:r>
+    </w:p>
+    <w:p>
+      <w:r>
         <w:t>3. Return total.</w:t>
       </w:r>
-      <w:r>
-        <w:br/>
-      </w:r>
     </w:p>
+    <w:p/>
     <w:p>
       <w:r>
         <w:t>Return:</w:t>
@@ -243,26 +298,59 @@
         <w:t>Total expenses as a float.</w:t>
       </w:r>
     </w:p>
+    <w:p/>
+    <w:p/>
+    <w:p/>
+    <w:p/>
+    <w:p/>
+    <w:p/>
+    <w:p/>
     <w:p>
       <w:r>
-        <w:br/>
-        <w:t>## Function: find_highest</w:t>
+        <w:rPr>
+          <w:b/>
+          <w:bCs/>
+          <w:sz w:val="24"/>
+          <w:szCs w:val="24"/>
+        </w:rPr>
+        <w:lastRenderedPageBreak/>
+        <w:t>## Function:</w:t>
       </w:r>
       <w:r>
-        <w:br/>
+        <w:rPr>
+          <w:sz w:val="24"/>
+          <w:szCs w:val="24"/>
+        </w:rPr>
+        <w:t xml:space="preserve"> </w:t>
+      </w:r>
+      <w:proofErr w:type="spellStart"/>
+      <w:r>
+        <w:t>find_highest</w:t>
+      </w:r>
+      <w:proofErr w:type="spellEnd"/>
+    </w:p>
+    <w:p>
+      <w:r>
+        <w:t xml:space="preserve">This function uses </w:t>
+      </w:r>
+      <w:proofErr w:type="gramStart"/>
+      <w:r>
+        <w:t>reduce(</w:t>
+      </w:r>
+      <w:proofErr w:type="gramEnd"/>
+      <w:r>
+        <w:t>) to find the expense with the highest amount.</w:t>
       </w:r>
     </w:p>
     <w:p>
       <w:r>
         <w:t>Parameters:</w:t>
       </w:r>
-    </w:p>
-    <w:p>
+      <w:r>
+        <w:t xml:space="preserve"> </w:t>
+      </w:r>
       <w:r>
         <w:t>expenses (list): List of expense tuples.</w:t>
-      </w:r>
-      <w:r>
-        <w:br/>
       </w:r>
     </w:p>
     <w:p>
@@ -272,12 +360,18 @@
     </w:p>
     <w:p>
       <w:r>
-        <w:t>highest (tuple): Stores highest expense.</w:t>
+        <w:t xml:space="preserve">highest (tuple): </w:t>
       </w:r>
+      <w:proofErr w:type="gramStart"/>
       <w:r>
-        <w:br/>
+        <w:t>Stores</w:t>
+      </w:r>
+      <w:proofErr w:type="gramEnd"/>
+      <w:r>
+        <w:t xml:space="preserve"> highest expense.</w:t>
       </w:r>
     </w:p>
+    <w:p/>
     <w:p>
       <w:r>
         <w:t>Logic:</w:t>
@@ -285,20 +379,28 @@
     </w:p>
     <w:p>
       <w:r>
-        <w:t>1. Use reduce() to compare expense amounts.</w:t>
+        <w:t xml:space="preserve">1. Use </w:t>
       </w:r>
+      <w:proofErr w:type="gramStart"/>
       <w:r>
-        <w:br/>
+        <w:t>reduce(</w:t>
+      </w:r>
+      <w:proofErr w:type="gramEnd"/>
+      <w:r>
+        <w:t>) to compare expense amounts.</w:t>
+      </w:r>
+    </w:p>
+    <w:p>
+      <w:r>
         <w:t>2. Keep the largest value.</w:t>
       </w:r>
+    </w:p>
+    <w:p>
       <w:r>
-        <w:br/>
         <w:t>3. Return highest expense tuple.</w:t>
       </w:r>
-      <w:r>
-        <w:br/>
-      </w:r>
     </w:p>
+    <w:p/>
     <w:p>
       <w:r>
         <w:t>Return:</w:t>
@@ -309,11 +411,8 @@
         <w:t>Tuple containing highest expense.</w:t>
       </w:r>
     </w:p>
+    <w:p/>
     <w:p>
-      <w:r>
-        <w:lastRenderedPageBreak/>
-        <w:br/>
-      </w:r>
       <w:r>
         <w:rPr>
           <w:b/>
@@ -324,23 +423,40 @@
         <w:t>## Function:</w:t>
       </w:r>
       <w:r>
-        <w:t xml:space="preserve"> find_lowest</w:t>
+        <w:rPr>
+          <w:sz w:val="24"/>
+          <w:szCs w:val="24"/>
+        </w:rPr>
+        <w:t xml:space="preserve"> </w:t>
       </w:r>
+      <w:proofErr w:type="spellStart"/>
       <w:r>
-        <w:br/>
+        <w:t>find_lowest</w:t>
+      </w:r>
+      <w:proofErr w:type="spellEnd"/>
+    </w:p>
+    <w:p>
+      <w:r>
+        <w:t xml:space="preserve">This function uses </w:t>
+      </w:r>
+      <w:proofErr w:type="gramStart"/>
+      <w:r>
+        <w:t>reduce(</w:t>
+      </w:r>
+      <w:proofErr w:type="gramEnd"/>
+      <w:r>
+        <w:t>) to find the expense with the lowest amount.</w:t>
       </w:r>
     </w:p>
     <w:p>
       <w:r>
         <w:t>Parameters:</w:t>
       </w:r>
-    </w:p>
-    <w:p>
+      <w:r>
+        <w:t xml:space="preserve"> </w:t>
+      </w:r>
       <w:r>
         <w:t>expenses (list): List of expense tuples.</w:t>
-      </w:r>
-      <w:r>
-        <w:br/>
       </w:r>
     </w:p>
     <w:p>
@@ -352,10 +468,8 @@
       <w:r>
         <w:t>lowest (tuple): Stores lowest expense.</w:t>
       </w:r>
-      <w:r>
-        <w:br/>
-      </w:r>
     </w:p>
+    <w:p/>
     <w:p>
       <w:r>
         <w:t>Logic:</w:t>
@@ -363,22 +477,32 @@
     </w:p>
     <w:p>
       <w:r>
-        <w:t>1. Use reduce() to compare expense amounts.</w:t>
+        <w:t xml:space="preserve">1. Use </w:t>
       </w:r>
+      <w:proofErr w:type="gramStart"/>
       <w:r>
-        <w:br/>
-        <w:t>2. Keep the smallest value.</w:t>
+        <w:t>reduce(</w:t>
       </w:r>
+      <w:proofErr w:type="gramEnd"/>
       <w:r>
-        <w:br/>
-        <w:t>3. Return lowest expense tuple.</w:t>
-      </w:r>
-      <w:r>
-        <w:br/>
+        <w:t>) to compare expense amounts.</w:t>
       </w:r>
     </w:p>
     <w:p>
       <w:r>
+        <w:t>2. Keep the smallest value.</w:t>
+      </w:r>
+    </w:p>
+    <w:p>
+      <w:r>
+        <w:t>3. Return lowest expense tuple.</w:t>
+      </w:r>
+    </w:p>
+    <w:p/>
+    <w:p/>
+    <w:p>
+      <w:r>
+        <w:lastRenderedPageBreak/>
         <w:t>Return:</w:t>
       </w:r>
     </w:p>
@@ -387,26 +511,44 @@
         <w:t>Tuple containing lowest expense.</w:t>
       </w:r>
     </w:p>
+    <w:p/>
+    <w:p/>
     <w:p>
       <w:r>
-        <w:br/>
-        <w:t>## Function: main</w:t>
+        <w:rPr>
+          <w:b/>
+          <w:bCs/>
+          <w:sz w:val="24"/>
+          <w:szCs w:val="24"/>
+        </w:rPr>
+        <w:t>## Function:</w:t>
       </w:r>
       <w:r>
-        <w:br/>
+        <w:rPr>
+          <w:sz w:val="24"/>
+          <w:szCs w:val="24"/>
+        </w:rPr>
+        <w:t xml:space="preserve"> </w:t>
+      </w:r>
+      <w:r>
+        <w:t>main</w:t>
+      </w:r>
+    </w:p>
+    <w:p/>
+    <w:p>
+      <w:r>
+        <w:t>This function runs the program and prints the total, highest, and lowest expenses.</w:t>
       </w:r>
     </w:p>
     <w:p>
       <w:r>
         <w:t>Parameters:</w:t>
       </w:r>
-    </w:p>
-    <w:p>
+      <w:r>
+        <w:t xml:space="preserve"> </w:t>
+      </w:r>
       <w:r>
         <w:t>None</w:t>
-      </w:r>
-      <w:r>
-        <w:br/>
       </w:r>
     </w:p>
     <w:p>
@@ -418,22 +560,23 @@
       <w:r>
         <w:t>expenses (list): Stores user expenses.</w:t>
       </w:r>
+    </w:p>
+    <w:p>
       <w:r>
-        <w:br/>
         <w:t>total (float): Total expenses.</w:t>
       </w:r>
+    </w:p>
+    <w:p>
       <w:r>
-        <w:br/>
         <w:t>highest (tuple): Highest expense.</w:t>
       </w:r>
+    </w:p>
+    <w:p>
       <w:r>
-        <w:br/>
         <w:t>lowest (tuple): Lowest expense.</w:t>
       </w:r>
-      <w:r>
-        <w:br/>
-      </w:r>
     </w:p>
+    <w:p/>
     <w:p>
       <w:r>
         <w:t>Logic:</w:t>
@@ -441,66 +584,80 @@
     </w:p>
     <w:p>
       <w:r>
-        <w:t>1. Call get_expenses().</w:t>
+        <w:t xml:space="preserve">1. Call </w:t>
       </w:r>
+      <w:proofErr w:type="spellStart"/>
       <w:r>
-        <w:br/>
-        <w:t>2. Calculate total expenses.</w:t>
+        <w:t>get_</w:t>
       </w:r>
+      <w:proofErr w:type="gramStart"/>
       <w:r>
-        <w:br/>
-        <w:t>3. Find highest and lowest expenses.</w:t>
+        <w:t>expenses</w:t>
       </w:r>
+      <w:proofErr w:type="spellEnd"/>
       <w:r>
-        <w:br/>
+        <w:t>(</w:t>
       </w:r>
+      <w:proofErr w:type="gramEnd"/>
       <w:r>
-        <w:lastRenderedPageBreak/>
-        <w:t>4. Display formatted results.</w:t>
-      </w:r>
-      <w:r>
-        <w:br/>
+        <w:t>).</w:t>
       </w:r>
     </w:p>
     <w:p>
       <w:r>
-        <w:t>Return:</w:t>
+        <w:t>2. Calculate total expenses.</w:t>
       </w:r>
     </w:p>
     <w:p>
       <w:r>
-        <w:t>None</w:t>
+        <w:t>3. Find highest and lowest expenses.</w:t>
       </w:r>
     </w:p>
     <w:p>
       <w:r>
-        <w:br/>
+        <w:t>4. Display formatted results.</w:t>
+      </w:r>
+    </w:p>
+    <w:p/>
+    <w:p>
+      <w:r>
+        <w:t>Return:</w:t>
       </w:r>
       <w:r>
+        <w:t xml:space="preserve"> </w:t>
+      </w:r>
+      <w:r>
+        <w:t>None</w:t>
+      </w:r>
+    </w:p>
+    <w:p/>
+    <w:p/>
+    <w:p/>
+    <w:p/>
+    <w:p/>
+    <w:p>
+      <w:r>
+        <w:lastRenderedPageBreak/>
         <w:t xml:space="preserve"># Link to </w:t>
       </w:r>
+      <w:proofErr w:type="gramStart"/>
       <w:r>
         <w:t xml:space="preserve">my </w:t>
       </w:r>
       <w:r>
-        <w:t xml:space="preserve">repository: </w:t>
+        <w:t xml:space="preserve"> repository</w:t>
       </w:r>
-      <w:hyperlink r:id="rId6" w:history="1">
-        <w:r>
-          <w:rPr>
-            <w:rStyle w:val="Hyperlink"/>
-          </w:rPr>
-          <w:t>https://github.com/ggriaa/COP2373</w:t>
-        </w:r>
-      </w:hyperlink>
+      <w:proofErr w:type="gramEnd"/>
+      <w:r>
+        <w:t>: https://github.com/ggriaa/COP2373</w:t>
+      </w:r>
     </w:p>
+    <w:p/>
+    <w:p/>
     <w:p>
       <w:r>
-        <w:br/>
         <w:t>Program Output Screenshot:</w:t>
       </w:r>
-    </w:p>
-    <w:p>
       <w:r>
         <w:rPr>
           <w:noProof/>
@@ -521,7 +678,7 @@
                     <pic:cNvPicPr/>
                   </pic:nvPicPr>
                   <pic:blipFill>
-                    <a:blip r:embed="rId7"/>
+                    <a:blip r:embed="rId6"/>
                     <a:stretch>
                       <a:fillRect/>
                     </a:stretch>

</xml_diff>